<commit_message>
Add Jaume Flaquer Garcia and refresh bilingual booklets
</commit_message>
<xml_diff>
--- a/dist/documents/DIALOGIA-2026-FR.docx
+++ b/dist/documents/DIALOGIA-2026-FR.docx
@@ -472,6 +472,7 @@
           <w:lang w:val="fr-FR"/>
         </w:rPr>
       </w:pPr>
+      <w:proofErr w:type="gramStart"/>
       <w:r>
         <w:rPr>
           <w:b/>
@@ -479,7 +480,17 @@
           <w:sz w:val="44"/>
           <w:lang w:val="fr-FR"/>
         </w:rPr>
-        <w:t>et « en dialogue avec » l’IA</w:t>
+        <w:t>et</w:t>
+      </w:r>
+      <w:proofErr w:type="gramEnd"/>
+      <w:r>
+        <w:rPr>
+          <w:b/>
+          <w:color w:val="173B4D"/>
+          <w:sz w:val="44"/>
+          <w:lang w:val="fr-FR"/>
+        </w:rPr>
+        <w:t xml:space="preserve"> « en dialogue avec » l’IA</w:t>
       </w:r>
     </w:p>
     <w:p>
@@ -4872,6 +4883,7 @@
               </w:rPr>
             </w:pPr>
             <w:proofErr w:type="spellStart"/>
+            <w:proofErr w:type="gramStart"/>
             <w:r>
               <w:rPr>
                 <w:b/>
@@ -4891,7 +4903,18 @@
                 <w:sz w:val="20"/>
                 <w:szCs w:val="20"/>
               </w:rPr>
-              <w:t xml:space="preserve"> : Patrice Brodeur</w:t>
+              <w:t xml:space="preserve"> :</w:t>
+            </w:r>
+            <w:proofErr w:type="gramEnd"/>
+            <w:r>
+              <w:rPr>
+                <w:b/>
+                <w:bCs/>
+                <w:color w:val="FFFFFF"/>
+                <w:sz w:val="20"/>
+                <w:szCs w:val="20"/>
+              </w:rPr>
+              <w:t xml:space="preserve"> Patrice Brodeur</w:t>
             </w:r>
           </w:p>
         </w:tc>
@@ -4918,6 +4941,7 @@
       </w:pPr>
       <w:r>
         <w:rPr>
+          <w:rFonts w:cs="Noto Sans"/>
           <w:b/>
           <w:bCs/>
           <w:lang w:val="fr-CA"/>
@@ -4995,9 +5019,9 @@
         <w:keepLines/>
         <w:spacing w:after="40" w:line="240" w:lineRule="auto"/>
         <w:rPr>
+          <w:color w:val="23323A"/>
           <w:sz w:val="20"/>
           <w:szCs w:val="20"/>
-          <w:lang w:val="fr-FR"/>
         </w:rPr>
       </w:pPr>
       <w:r>
@@ -5008,6 +5032,77 @@
           <w:lang w:val="fr-FR"/>
         </w:rPr>
         <w:t>Repenser la recherche bibliographique en études (inter)religieuses grâce à un agent conversationnel</w:t>
+      </w:r>
+    </w:p>
+    <w:p>
+      <w:pPr>
+        <w:pStyle w:val="NormalWeb"/>
+        <w:spacing w:before="0" w:beforeAutospacing="0" w:after="0" w:afterAutospacing="0"/>
+        <w:rPr>
+          <w:rFonts w:ascii="Noto Sans" w:hAnsi="Noto Sans" w:cs="Noto Sans"/>
+          <w:sz w:val="18"/>
+          <w:szCs w:val="18"/>
+          <w:lang w:val="fr-CA"/>
+        </w:rPr>
+      </w:pPr>
+      <w:r>
+        <w:rPr>
+          <w:rFonts w:ascii="Noto Sans" w:hAnsi="Noto Sans" w:cs="Noto Sans"/>
+          <w:b/>
+          <w:bCs/>
+          <w:sz w:val="18"/>
+          <w:szCs w:val="18"/>
+          <w:lang w:val="fr-CA"/>
+        </w:rPr>
+        <w:t>Jaume Flaquer Garcia</w:t>
+      </w:r>
+      <w:r>
+        <w:rPr>
+          <w:rFonts w:ascii="Noto Sans" w:hAnsi="Noto Sans" w:cs="Noto Sans"/>
+          <w:sz w:val="18"/>
+          <w:szCs w:val="18"/>
+          <w:lang w:val="fr-CA"/>
+        </w:rPr>
+        <w:t xml:space="preserve"> — Loyola </w:t>
+      </w:r>
+      <w:proofErr w:type="spellStart"/>
+      <w:r>
+        <w:rPr>
+          <w:rFonts w:ascii="Noto Sans" w:hAnsi="Noto Sans" w:cs="Noto Sans"/>
+          <w:sz w:val="18"/>
+          <w:szCs w:val="18"/>
+          <w:lang w:val="fr-CA"/>
+        </w:rPr>
+        <w:t>University</w:t>
+      </w:r>
+      <w:proofErr w:type="spellEnd"/>
+      <w:r>
+        <w:rPr>
+          <w:rFonts w:ascii="Noto Sans" w:hAnsi="Noto Sans" w:cs="Noto Sans"/>
+          <w:sz w:val="18"/>
+          <w:szCs w:val="18"/>
+          <w:lang w:val="fr-CA"/>
+        </w:rPr>
+        <w:t xml:space="preserve"> / PLURIEL</w:t>
+      </w:r>
+    </w:p>
+    <w:p>
+      <w:pPr>
+        <w:pStyle w:val="NormalWeb"/>
+        <w:spacing w:before="0" w:beforeAutospacing="0" w:after="0" w:afterAutospacing="0"/>
+        <w:rPr>
+          <w:rFonts w:ascii="Noto Sans" w:hAnsi="Noto Sans" w:cs="Noto Sans"/>
+          <w:sz w:val="18"/>
+          <w:szCs w:val="18"/>
+        </w:rPr>
+      </w:pPr>
+      <w:r>
+        <w:rPr>
+          <w:rFonts w:ascii="Noto Sans" w:hAnsi="Noto Sans" w:cs="Noto Sans"/>
+          <w:sz w:val="18"/>
+          <w:szCs w:val="18"/>
+        </w:rPr>
+        <w:t>Preaching in the Age of Artificial Intelligence: Challenges and Implications</w:t>
       </w:r>
     </w:p>
     <w:p>
@@ -5346,6 +5441,7 @@
               </w:rPr>
             </w:pPr>
             <w:proofErr w:type="spellStart"/>
+            <w:proofErr w:type="gramStart"/>
             <w:r>
               <w:rPr>
                 <w:b/>
@@ -5365,7 +5461,18 @@
                 <w:sz w:val="20"/>
                 <w:szCs w:val="20"/>
               </w:rPr>
-              <w:t xml:space="preserve"> : </w:t>
+              <w:t xml:space="preserve"> :</w:t>
+            </w:r>
+            <w:proofErr w:type="gramEnd"/>
+            <w:r>
+              <w:rPr>
+                <w:b/>
+                <w:bCs/>
+                <w:color w:val="FFFFFF"/>
+                <w:sz w:val="20"/>
+                <w:szCs w:val="20"/>
+              </w:rPr>
+              <w:t xml:space="preserve"> </w:t>
             </w:r>
             <w:r>
               <w:rPr>
@@ -5816,6 +5923,7 @@
           <w:szCs w:val="20"/>
           <w:lang w:val="fr-FR"/>
         </w:rPr>
+        <w:lastRenderedPageBreak/>
         <w:t xml:space="preserve">13 h 00 – 14 h </w:t>
       </w:r>
       <w:r>
@@ -5930,6 +6038,7 @@
               </w:rPr>
             </w:pPr>
             <w:proofErr w:type="spellStart"/>
+            <w:proofErr w:type="gramStart"/>
             <w:r>
               <w:rPr>
                 <w:b/>
@@ -5949,7 +6058,18 @@
                 <w:sz w:val="20"/>
                 <w:szCs w:val="20"/>
               </w:rPr>
-              <w:t xml:space="preserve"> : Emmanuel Pisani</w:t>
+              <w:t xml:space="preserve"> :</w:t>
+            </w:r>
+            <w:proofErr w:type="gramEnd"/>
+            <w:r>
+              <w:rPr>
+                <w:b/>
+                <w:bCs/>
+                <w:color w:val="FFFFFF"/>
+                <w:sz w:val="20"/>
+                <w:szCs w:val="20"/>
+              </w:rPr>
+              <w:t xml:space="preserve"> Emmanuel Pisani</w:t>
             </w:r>
           </w:p>
         </w:tc>
@@ -7033,6 +7153,7 @@
               </w:rPr>
             </w:pPr>
             <w:proofErr w:type="spellStart"/>
+            <w:proofErr w:type="gramStart"/>
             <w:r>
               <w:rPr>
                 <w:b/>
@@ -7052,8 +7173,9 @@
                 <w:sz w:val="20"/>
                 <w:szCs w:val="20"/>
               </w:rPr>
-              <w:t xml:space="preserve"> : </w:t>
+              <w:t xml:space="preserve"> :</w:t>
             </w:r>
+            <w:proofErr w:type="gramEnd"/>
             <w:r>
               <w:rPr>
                 <w:b/>
@@ -7062,8 +7184,20 @@
                 <w:sz w:val="20"/>
                 <w:szCs w:val="20"/>
               </w:rPr>
+              <w:t xml:space="preserve"> </w:t>
+            </w:r>
+            <w:proofErr w:type="gramStart"/>
+            <w:r>
+              <w:rPr>
+                <w:b/>
+                <w:bCs/>
+                <w:color w:val="FFFFFF"/>
+                <w:sz w:val="20"/>
+                <w:szCs w:val="20"/>
+              </w:rPr>
               <w:t>Wael  Saleh</w:t>
             </w:r>
+            <w:proofErr w:type="gramEnd"/>
           </w:p>
         </w:tc>
       </w:tr>
@@ -9881,6 +10015,176 @@
         <w:keepLines/>
         <w:spacing w:before="40" w:after="0" w:line="228" w:lineRule="auto"/>
         <w:rPr>
+          <w:rFonts w:eastAsia="Times New Roman" w:cs="Noto Sans"/>
+          <w:b/>
+          <w:bCs/>
+          <w:szCs w:val="18"/>
+          <w:lang w:val="fr-CA" w:eastAsia="en-AE"/>
+        </w:rPr>
+      </w:pPr>
+      <w:r>
+        <w:rPr>
+          <w:rFonts w:eastAsia="Times New Roman" w:cs="Noto Sans"/>
+          <w:b/>
+          <w:bCs/>
+          <w:szCs w:val="18"/>
+          <w:lang w:val="fr-CA" w:eastAsia="en-AE"/>
+        </w:rPr>
+        <w:t xml:space="preserve">Jaume Flaquer Garcia —Loyola </w:t>
+      </w:r>
+      <w:proofErr w:type="spellStart"/>
+      <w:r>
+        <w:rPr>
+          <w:rFonts w:eastAsia="Times New Roman" w:cs="Noto Sans"/>
+          <w:b/>
+          <w:bCs/>
+          <w:szCs w:val="18"/>
+          <w:lang w:val="fr-CA" w:eastAsia="en-AE"/>
+        </w:rPr>
+        <w:t>University</w:t>
+      </w:r>
+      <w:proofErr w:type="spellEnd"/>
+      <w:r>
+        <w:rPr>
+          <w:rFonts w:eastAsia="Times New Roman" w:cs="Noto Sans"/>
+          <w:b/>
+          <w:bCs/>
+          <w:szCs w:val="18"/>
+          <w:lang w:val="fr-CA" w:eastAsia="en-AE"/>
+        </w:rPr>
+        <w:t xml:space="preserve"> / PLURIEL</w:t>
+      </w:r>
+    </w:p>
+    <w:p>
+      <w:pPr>
+        <w:keepNext/>
+        <w:keepLines/>
+        <w:spacing w:before="40" w:after="0" w:line="228" w:lineRule="auto"/>
+        <w:rPr>
+          <w:rFonts w:eastAsia="Times New Roman" w:cs="Noto Sans"/>
+          <w:b/>
+          <w:bCs/>
+          <w:sz w:val="4"/>
+          <w:szCs w:val="4"/>
+          <w:lang w:val="fr-CA" w:eastAsia="en-AE"/>
+        </w:rPr>
+      </w:pPr>
+    </w:p>
+    <w:p>
+      <w:pPr>
+        <w:keepNext/>
+        <w:keepLines/>
+        <w:spacing w:before="40" w:after="0" w:line="228" w:lineRule="auto"/>
+        <w:rPr>
+          <w:b/>
+          <w:bCs/>
+          <w:lang w:val="fr-CA"/>
+        </w:rPr>
+      </w:pPr>
+      <w:r>
+        <w:rPr>
+          <w:rFonts w:eastAsia="Times New Roman" w:cs="Noto Sans"/>
+          <w:b/>
+          <w:bCs/>
+          <w:szCs w:val="18"/>
+          <w:lang w:val="fr-CA" w:eastAsia="en-AE"/>
+        </w:rPr>
+        <w:t>La prédication à l’épreuve de l’intelligence artificielle</w:t>
+      </w:r>
+    </w:p>
+    <w:p>
+      <w:pPr>
+        <w:keepNext/>
+        <w:keepLines/>
+        <w:spacing w:before="40" w:after="0" w:line="228" w:lineRule="auto"/>
+        <w:rPr>
+          <w:b/>
+          <w:bCs/>
+          <w:lang w:val="fr-CA"/>
+        </w:rPr>
+      </w:pPr>
+    </w:p>
+    <w:p>
+      <w:pPr>
+        <w:keepNext/>
+        <w:keepLines/>
+        <w:spacing w:before="40" w:after="0" w:line="228" w:lineRule="auto"/>
+        <w:jc w:val="both"/>
+        <w:rPr>
+          <w:lang w:val="fr-CA"/>
+        </w:rPr>
+      </w:pPr>
+      <w:r>
+        <w:rPr>
+          <w:lang w:val="fr-CA"/>
+        </w:rPr>
+        <w:t>Cet</w:t>
+      </w:r>
+      <w:r>
+        <w:rPr>
+          <w:lang w:val="fr-CA"/>
+        </w:rPr>
+        <w:t xml:space="preserve">te intervention </w:t>
+      </w:r>
+      <w:r>
+        <w:rPr>
+          <w:lang w:val="fr-CA"/>
+        </w:rPr>
+        <w:t>examine</w:t>
+      </w:r>
+      <w:r>
+        <w:rPr>
+          <w:lang w:val="fr-CA"/>
+        </w:rPr>
+        <w:t xml:space="preserve"> l'impact de l'intelligence artificielle sur la prédication chrétienne et musulmane. Si l'IA offre des gains d'efficacité rédactionnelle incontestables, elle suscite des mises en garde de la part des autorités religieuses. Dans le catholicisme, la prédication est un acte liturgique indissociable du témoignage humain et de la foi partagée, des dimensions qu'une machine ne saurait reproduire. Dans l'islam, bien que l'IA puisse servir d'outil d'aide pour structurer le sermon (</w:t>
+      </w:r>
+      <w:proofErr w:type="spellStart"/>
+      <w:r>
+        <w:rPr>
+          <w:lang w:val="fr-CA"/>
+        </w:rPr>
+        <w:t>khuṭba</w:t>
+      </w:r>
+      <w:proofErr w:type="spellEnd"/>
+      <w:r>
+        <w:rPr>
+          <w:lang w:val="fr-CA"/>
+        </w:rPr>
+        <w:t>), ce dernier exige une intention religieuse (</w:t>
+      </w:r>
+      <w:proofErr w:type="spellStart"/>
+      <w:r>
+        <w:rPr>
+          <w:lang w:val="fr-CA"/>
+        </w:rPr>
+        <w:t>niyya</w:t>
+      </w:r>
+      <w:proofErr w:type="spellEnd"/>
+      <w:r>
+        <w:rPr>
+          <w:lang w:val="fr-CA"/>
+        </w:rPr>
+        <w:t>) et un prédicateur juridiquement responsable. De plus, le recours à l'IA pour émettre des fatwas reste strictement interdit, faute de capacité d'adaptation aux contextes particuliers. Finalement, cette confrontation avec l'IA permet de réaffirmer la valeur irremplaçable de l'humain au cœur du culte et de la liturgie.</w:t>
+      </w:r>
+    </w:p>
+    <w:p>
+      <w:pPr>
+        <w:keepNext/>
+        <w:keepLines/>
+        <w:spacing w:before="40" w:after="0" w:line="228" w:lineRule="auto"/>
+        <w:rPr>
+          <w:b/>
+          <w:bCs/>
+          <w:lang w:val="fr-CA"/>
+        </w:rPr>
+      </w:pPr>
+    </w:p>
+    <w:p>
+      <w:pPr>
+        <w:keepNext/>
+        <w:keepLines/>
+        <w:spacing w:before="40" w:after="0" w:line="228" w:lineRule="auto"/>
+        <w:rPr>
           <w:b/>
           <w:bCs/>
           <w:sz w:val="20"/>
@@ -10071,7 +10375,16 @@
           <w:szCs w:val="18"/>
           <w:lang w:val="fr-FR"/>
         </w:rPr>
-        <w:t>Une solution proposée est un pipeline agentique en cinq étapes — OCR, identification des sources, curation par des experts, indexation vectorielle, puis IA de dialogue citant systématiquement ses sources. [Un exemple (question sur le pardon en islam) illustre la différence entre une réponse vague et une réponse sourcée citant le Coran, un hadith et des commentateurs reconnus.]</w:t>
+        <w:t xml:space="preserve">Une solution proposée est un pipeline agentique en cinq étapes — OCR, identification des sources, curation par des experts, indexation vectorielle, puis IA de dialogue citant systématiquement ses sources. [Un exemple (question sur le pardon en islam) illustre la différence entre une réponse </w:t>
+      </w:r>
+      <w:r>
+        <w:rPr>
+          <w:color w:val="23323A"/>
+          <w:szCs w:val="18"/>
+          <w:lang w:val="fr-FR"/>
+        </w:rPr>
+        <w:lastRenderedPageBreak/>
+        <w:t>vague et une réponse sourcée citant le Coran, un hadith et des commentateurs reconnus.]</w:t>
       </w:r>
     </w:p>
     <w:p>
@@ -10193,7 +10506,6 @@
           <w:szCs w:val="18"/>
           <w:lang w:val="fr-FR"/>
         </w:rPr>
-        <w:lastRenderedPageBreak/>
         <w:t>À partir de l’islam contemporain, la communication distingue deux niveaux de représentativité. Le premier, externe, relève des dispositifs de connaissance et de médiation qui construisent l’objet religieux. Le second, interne, concerne les mécanismes par lesquels acteurs, institutions et traditions déterminent ce qui peut être reconnu comme légitime, orthodoxe, représentatif ou marginal. Leur articulation produit une représentativité stratifiée, reconduisant des hiérarchies sous l’apparence d’une représentation générale de l’islam.</w:t>
       </w:r>
     </w:p>
@@ -10820,7 +11132,16 @@
           <w:szCs w:val="18"/>
           <w:lang w:val="fr-CA"/>
         </w:rPr>
-        <w:t xml:space="preserve">Cette communication examine les conditions dans lesquelles l’intelligence artificielle peut soutenir le dialogue interreligieux en tant que médiatrice sans se substituer au jugement humain, à la responsabilité ni à la compréhension contextuelle. S’appuyant sur les défis pratiques liés à la conception et à l’expérimentation d’une médiation dialogique assistée par l’IA, elle se concentre sur trois dimensions interdépendantes : la fiabilité, la responsabilité et les limites. La fiabilité concerne la qualité des sources, la représentation de la pluralité interne des traditions religieuses, la contextualisation et la distinction entre information vérifiable et interprétation. La responsabilité porte sur la détermination des acteurs qui demeurent redevables lorsqu’un système d’IA sélectionne, reformule, hiérarchise ou modère des contenus religieux sensibles, ainsi que sur l’organisation de la correction, de la contestation et de la supervision humaine. Les limites renvoient aux situations dans lesquelles l’intervention algorithmique peut se révéler inadéquate ou inappropriée, notamment lorsque sont en jeu l’identité, le traumatisme, des rapports de pouvoir asymétriques, des valeurs sacrées ou des désaccords profonds. La communication défend une approche « humain dans la boucle » (Human-in-the-Loop), dans laquelle l’IA contribue à la clarification, à la </w:t>
+        <w:t xml:space="preserve">Cette communication examine les conditions dans lesquelles l’intelligence artificielle peut soutenir le dialogue interreligieux en tant que médiatrice sans se substituer au jugement humain, à la responsabilité ni à la compréhension contextuelle. S’appuyant sur les défis pratiques liés à la conception et à l’expérimentation d’une médiation dialogique assistée par l’IA, elle se concentre sur trois dimensions interdépendantes : la fiabilité, la responsabilité </w:t>
+      </w:r>
+      <w:r>
+        <w:rPr>
+          <w:color w:val="23323A"/>
+          <w:szCs w:val="18"/>
+          <w:lang w:val="fr-CA"/>
+        </w:rPr>
+        <w:lastRenderedPageBreak/>
+        <w:t xml:space="preserve">et les limites. La fiabilité concerne la qualité des sources, la représentation de la pluralité interne des traditions religieuses, la contextualisation et la distinction entre information vérifiable et interprétation. La responsabilité porte sur la détermination des acteurs qui demeurent redevables lorsqu’un système d’IA sélectionne, reformule, hiérarchise ou modère des contenus religieux sensibles, ainsi que sur l’organisation de la correction, de la contestation et de la supervision humaine. Les limites renvoient aux situations dans lesquelles l’intervention algorithmique peut se révéler inadéquate ou inappropriée, notamment lorsque sont en jeu l’identité, le traumatisme, des rapports de pouvoir asymétriques, des valeurs sacrées ou des désaccords profonds. La communication défend une approche « humain dans la boucle » (Human-in-the-Loop), dans laquelle l’IA contribue à la clarification, à la </w:t>
       </w:r>
       <w:proofErr w:type="spellStart"/>
       <w:r>
@@ -10838,16 +11159,7 @@
           <w:szCs w:val="18"/>
           <w:lang w:val="fr-CA"/>
         </w:rPr>
-        <w:t xml:space="preserve">, à la reformulation, à la validation des sources et à l’identification des convergences et divergences, tandis que la responsabilité finale demeure humaine. Elle conclut en proposant des critères pratiques d’évaluation du </w:t>
-      </w:r>
-      <w:r>
-        <w:rPr>
-          <w:color w:val="23323A"/>
-          <w:szCs w:val="18"/>
-          <w:lang w:val="fr-CA"/>
-        </w:rPr>
-        <w:lastRenderedPageBreak/>
-        <w:t xml:space="preserve">dialogue médiatisé par l’IA, notamment l’explicabilité, l’exactitude contextuelle, la neutralité procédurale, la sécurité, la dignité, l’équité et une gouvernance transparente dans des modèles hybrides de médiation humain–IA adaptés à des contextes religieux, culturels et linguistiques divers. Ces critères visent à orienter la validation expérimentale de </w:t>
+        <w:t xml:space="preserve">, à la reformulation, à la validation des sources et à l’identification des convergences et divergences, tandis que la responsabilité finale demeure humaine. Elle conclut en proposant des critères pratiques d’évaluation du dialogue médiatisé par l’IA, notamment l’explicabilité, l’exactitude contextuelle, la neutralité procédurale, la sécurité, la dignité, l’équité et une gouvernance transparente dans des modèles hybrides de médiation humain–IA adaptés à des contextes religieux, culturels et linguistiques divers. Ces critères visent à orienter la validation expérimentale de </w:t>
       </w:r>
       <w:proofErr w:type="spellStart"/>
       <w:r>
@@ -11127,7 +11439,25 @@
           <w:szCs w:val="18"/>
           <w:lang w:val="fr-FR"/>
         </w:rPr>
-        <w:t>À l'intersection de l'architecture, de la philosophie et de la technologie, cette présentation explore le paradoxe d'une médiation « sans foi ». En nous appuyant sur le concept d’« hospitalité langagière » de Paul Ricœur, nous soutenons que l'IA ne doit pas être conçue comme un médiateur cherchant à créer un consensus, mais comme une infrastructure d'inter-traduction permettant à chacune de comprendre l’autre tout en préservant leurs différences.</w:t>
+        <w:t>À l'intersection de l'architecture, de la philosophie et de la technologie, cette présentation explore le paradoxe d'une médiation « sans foi ». En nous appuyant sur le concept d</w:t>
+      </w:r>
+      <w:proofErr w:type="gramStart"/>
+      <w:r>
+        <w:rPr>
+          <w:color w:val="23323A"/>
+          <w:szCs w:val="18"/>
+          <w:lang w:val="fr-FR"/>
+        </w:rPr>
+        <w:t>’«</w:t>
+      </w:r>
+      <w:proofErr w:type="gramEnd"/>
+      <w:r>
+        <w:rPr>
+          <w:color w:val="23323A"/>
+          <w:szCs w:val="18"/>
+          <w:lang w:val="fr-FR"/>
+        </w:rPr>
+        <w:t xml:space="preserve"> hospitalité langagière » de Paul Ricœur, nous soutenons que l'IA ne doit pas être conçue comme un médiateur cherchant à créer un consensus, mais comme une infrastructure d'inter-traduction permettant à chacune de comprendre l’autre tout en préservant leurs différences.</w:t>
       </w:r>
     </w:p>
     <w:p>
@@ -11145,15 +11475,7 @@
           <w:szCs w:val="18"/>
           <w:lang w:val="fr-FR"/>
         </w:rPr>
-        <w:t xml:space="preserve">Parce qu'elle ne croit pas, l'extériorité de l'IA devient sa force : elle lui permet de traduire et d'articuler les énoncés sans </w:t>
-      </w:r>
-      <w:r>
-        <w:rPr>
-          <w:color w:val="23323A"/>
-          <w:szCs w:val="18"/>
-          <w:lang w:val="fr-FR"/>
-        </w:rPr>
-        <w:t>annexer la différence de l'autre. L'IA offre ainsi un espace neutre de rencontre où elle aide les différentes religions à mieux se comprendre sans réduire le mystère de leur foi. Enfin, au cœur du dialogue demeure l’humain, qui seul peut faire de la compréhension une rencontre, et de la rencontre une expérience de foi.</w:t>
+        <w:t>Parce qu'elle ne croit pas, l'extériorité de l'IA devient sa force : elle lui permet de traduire et d'articuler les énoncés sans annexer la différence de l'autre. L'IA offre ainsi un espace neutre de rencontre où elle aide les différentes religions à mieux se comprendre sans réduire le mystère de leur foi. Enfin, au cœur du dialogue demeure l’humain, qui seul peut faire de la compréhension une rencontre, et de la rencontre une expérience de foi.</w:t>
       </w:r>
     </w:p>
     <w:p>
@@ -11309,7 +11631,43 @@
           <w:szCs w:val="18"/>
           <w:lang w:val="fr-FR"/>
         </w:rPr>
-        <w:t xml:space="preserve"> » «Saint Georges regardait ailleurs« de Jabbour </w:t>
+        <w:t xml:space="preserve"> »</w:t>
+      </w:r>
+      <w:proofErr w:type="gramStart"/>
+      <w:r>
+        <w:rPr>
+          <w:color w:val="23323A"/>
+          <w:szCs w:val="18"/>
+          <w:lang w:val="fr-FR"/>
+        </w:rPr>
+        <w:t xml:space="preserve"> «Saint</w:t>
+      </w:r>
+      <w:proofErr w:type="gramEnd"/>
+      <w:r>
+        <w:rPr>
+          <w:color w:val="23323A"/>
+          <w:szCs w:val="18"/>
+          <w:lang w:val="fr-FR"/>
+        </w:rPr>
+        <w:t xml:space="preserve"> Georges regardait </w:t>
+      </w:r>
+      <w:proofErr w:type="gramStart"/>
+      <w:r>
+        <w:rPr>
+          <w:color w:val="23323A"/>
+          <w:szCs w:val="18"/>
+          <w:lang w:val="fr-FR"/>
+        </w:rPr>
+        <w:t>ailleurs«</w:t>
+      </w:r>
+      <w:proofErr w:type="gramEnd"/>
+      <w:r>
+        <w:rPr>
+          <w:color w:val="23323A"/>
+          <w:szCs w:val="18"/>
+          <w:lang w:val="fr-FR"/>
+        </w:rPr>
+        <w:t xml:space="preserve"> de Jabbour </w:t>
       </w:r>
       <w:proofErr w:type="spellStart"/>
       <w:r>
@@ -11361,7 +11719,43 @@
           <w:szCs w:val="18"/>
           <w:lang w:val="fr-FR"/>
         </w:rPr>
-        <w:t xml:space="preserve"> » «Yusuf Al Inglizi» de Rabee Jaber, l’appel à la prière et la nouvelle de la conversion à l’islam du pasteur Shafard. Ce corpus, non exhaustif, prépare une recherche ultérieure. Chaque extrait est lu littérairement et soumis à trois interactions : expliquer le désaccord, reformuler les positions et intervenir comme tiers interprétant. L’analyse vérifie la source de la parole, la polyphonie, les degrés de certitude, le contexte et les ajouts non fondés textuellement.</w:t>
+        <w:t xml:space="preserve"> »</w:t>
+      </w:r>
+      <w:proofErr w:type="gramStart"/>
+      <w:r>
+        <w:rPr>
+          <w:color w:val="23323A"/>
+          <w:szCs w:val="18"/>
+          <w:lang w:val="fr-FR"/>
+        </w:rPr>
+        <w:t xml:space="preserve"> «Yusuf</w:t>
+      </w:r>
+      <w:proofErr w:type="gramEnd"/>
+      <w:r>
+        <w:rPr>
+          <w:color w:val="23323A"/>
+          <w:szCs w:val="18"/>
+          <w:lang w:val="fr-FR"/>
+        </w:rPr>
+        <w:t xml:space="preserve"> Al </w:t>
+      </w:r>
+      <w:proofErr w:type="gramStart"/>
+      <w:r>
+        <w:rPr>
+          <w:color w:val="23323A"/>
+          <w:szCs w:val="18"/>
+          <w:lang w:val="fr-FR"/>
+        </w:rPr>
+        <w:t>Inglizi»</w:t>
+      </w:r>
+      <w:proofErr w:type="gramEnd"/>
+      <w:r>
+        <w:rPr>
+          <w:color w:val="23323A"/>
+          <w:szCs w:val="18"/>
+          <w:lang w:val="fr-FR"/>
+        </w:rPr>
+        <w:t xml:space="preserve"> de Rabee Jaber, l’appel à la prière et la nouvelle de la conversion à l’islam du pasteur Shafard. Ce corpus, non exhaustif, prépare une recherche ultérieure. Chaque extrait est lu littérairement et soumis à trois interactions : expliquer le désaccord, reformuler les positions et intervenir comme tiers interprétant. L’analyse vérifie la source de la parole, la polyphonie, les degrés de certitude, le contexte et les ajouts non fondés textuellement.</w:t>
       </w:r>
     </w:p>
     <w:p>
@@ -11380,7 +11774,16 @@
           <w:szCs w:val="18"/>
           <w:lang w:val="fr-FR"/>
         </w:rPr>
-        <w:t>Les résultats préliminaires montrent que le système saisit l’événement général, mais le réécrit selon un modèle rationnel et le remplace par un consensus préétabli. Le secret, l’urgence et la réversibilité du baptême deviennent une décision assumée ; les strates d’énonciation, de mémoire et de récit collectif s’aplanissent dans l’appel à la prière. L’étude sera élargie à d’autres passages, modèles et indicateurs.</w:t>
+        <w:t xml:space="preserve">Les résultats préliminaires montrent que le système saisit l’événement général, mais le réécrit selon un modèle rationnel et le remplace par un consensus préétabli. Le secret, l’urgence et la réversibilité du baptême deviennent une décision assumée ; les strates d’énonciation, de mémoire et de récit collectif s’aplanissent dans l’appel à la </w:t>
+      </w:r>
+      <w:r>
+        <w:rPr>
+          <w:color w:val="23323A"/>
+          <w:szCs w:val="18"/>
+          <w:lang w:val="fr-FR"/>
+        </w:rPr>
+        <w:lastRenderedPageBreak/>
+        <w:t>prière. L’étude sera élargie à d’autres passages, modèles et indicateurs.</w:t>
       </w:r>
     </w:p>
     <w:p>
@@ -11586,16 +11989,7 @@
           <w:szCs w:val="18"/>
           <w:lang w:val="fr-CA"/>
         </w:rPr>
-        <w:t xml:space="preserve">, etc.) répondent aux questions interreligieuses et </w:t>
-      </w:r>
-      <w:r>
-        <w:rPr>
-          <w:color w:val="23323A"/>
-          <w:szCs w:val="18"/>
-          <w:lang w:val="fr-CA"/>
-        </w:rPr>
-        <w:lastRenderedPageBreak/>
-        <w:t>interconvictionnelles. Le référentiel interreligieux ICJS 1.0 mesurera et évaluera les réponses des plateformes à un ensemble diversifié de questions portant sur l’islam, le christianisme et le judaïsme, en appréciant l’exactitude factuelle et la présence de discours haineux, tout en tenant compte de la diversité interne des traditions religieuses et de formes plus subtiles de biais. Dans cette communication, je présenterai les travaux réalisés à ce jour et inviterai les participants à discuter des choix et considérations méthodologiques relatifs au référentiel, notamment la grille d’évaluation, l’intégration d’évaluateurs humains experts et les perspectives d’élargissement et d’amélioration des futurs référentiels.</w:t>
+        <w:t>, etc.) répondent aux questions interreligieuses et interconvictionnelles. Le référentiel interreligieux ICJS 1.0 mesurera et évaluera les réponses des plateformes à un ensemble diversifié de questions portant sur l’islam, le christianisme et le judaïsme, en appréciant l’exactitude factuelle et la présence de discours haineux, tout en tenant compte de la diversité interne des traditions religieuses et de formes plus subtiles de biais. Dans cette communication, je présenterai les travaux réalisés à ce jour et inviterai les participants à discuter des choix et considérations méthodologiques relatifs au référentiel, notamment la grille d’évaluation, l’intégration d’évaluateurs humains experts et les perspectives d’élargissement et d’amélioration des futurs référentiels.</w:t>
       </w:r>
     </w:p>
     <w:p>
@@ -11717,7 +12111,15 @@
           <w:szCs w:val="18"/>
           <w:lang w:val="fr-FR"/>
         </w:rPr>
-        <w:t>À partir d’une lecture croisée de travaux internationaux et de recherches scientifiques arabophones, notre démarche visera à examiner les promesses associées à l’IA sans dissocier celles-ci de leurs limites méthodologiques, éthiques et interculturelles. Une attention particulière sera portée à la contextualisation linguistique et religieuse, à la protection des droits ainsi qu’à la place des acteurs humains.</w:t>
+        <w:t xml:space="preserve">À partir d’une lecture croisée de travaux internationaux et de recherches scientifiques arabophones, notre démarche visera à examiner les promesses associées à l’IA sans dissocier celles-ci de leurs limites méthodologiques, éthiques et interculturelles. Une attention particulière sera portée à la </w:t>
+      </w:r>
+      <w:r>
+        <w:rPr>
+          <w:color w:val="23323A"/>
+          <w:szCs w:val="18"/>
+          <w:lang w:val="fr-FR"/>
+        </w:rPr>
+        <w:t>contextualisation linguistique et religieuse, à la protection des droits ainsi qu’à la place des acteurs humains.</w:t>
       </w:r>
     </w:p>
     <w:p>
@@ -11800,15 +12202,7 @@
           <w:szCs w:val="18"/>
           <w:lang w:val="fr-CA"/>
         </w:rPr>
-        <w:t xml:space="preserve">Cette communication examine la manière dont les groupes extrémistes et terroristes intègrent l’intelligence artificielle à leurs stratégies numériques et la façon dont ces évolutions reconfigurent le paysage sécuritaire. Adoptant la perspective des études sur le terrorisme et l’extrémisme, elle s’intéresse à l’usage opérationnel de l’IA générative pour la production de propagande, le recrutement, le ciblage idéologique, l’adaptation des récits, les médias synthétiques et l’amplification de contenus polarisants dans des environnements numériques multilingues. Une attention particulière est accordée à la manière dont les acteurs extrémistes exploitent des griefs sociaux existants, des tensions identitaires et des conflits politiques, en utilisant l’IA non comme une cause autonome de radicalisation, mais comme un multiplicateur de force qui accroît la vitesse, </w:t>
-      </w:r>
-      <w:r>
-        <w:rPr>
-          <w:color w:val="23323A"/>
-          <w:szCs w:val="18"/>
-          <w:lang w:val="fr-CA"/>
-        </w:rPr>
-        <w:t>l’ampleur, la personnalisation et la résilience de la communication extrémiste.</w:t>
+        <w:t>Cette communication examine la manière dont les groupes extrémistes et terroristes intègrent l’intelligence artificielle à leurs stratégies numériques et la façon dont ces évolutions reconfigurent le paysage sécuritaire. Adoptant la perspective des études sur le terrorisme et l’extrémisme, elle s’intéresse à l’usage opérationnel de l’IA générative pour la production de propagande, le recrutement, le ciblage idéologique, l’adaptation des récits, les médias synthétiques et l’amplification de contenus polarisants dans des environnements numériques multilingues. Une attention particulière est accordée à la manière dont les acteurs extrémistes exploitent des griefs sociaux existants, des tensions identitaires et des conflits politiques, en utilisant l’IA non comme une cause autonome de radicalisation, mais comme un multiplicateur de force qui accroît la vitesse, l’ampleur, la personnalisation et la résilience de la communication extrémiste.</w:t>
       </w:r>
     </w:p>
     <w:p>
@@ -11960,7 +12354,26 @@
           <w:szCs w:val="18"/>
           <w:lang w:val="fr-FR"/>
         </w:rPr>
-        <w:t>À partir de l’expérience d’un établissement scolaire interreligieux, cette contribution interroge le passage d’une IA conçue comme outil d’assistance à une IA médiatrice ou interlocutrice. Elle propose le concept d’« intelligence dialogique » pour désigner une compétence fondée sur l’écoute, la décentration, le discernement, la reconnaissance de l’altérité et la responsabilité. L’enjeu est de penser une éducation qui utilise l’IA sans lui déléguer le jugement humain, et qui fasse du dialogue interreligieux un apprentissage de la rencontre.</w:t>
+        <w:lastRenderedPageBreak/>
+        <w:t>À partir de l’expérience d’un établissement scolaire interreligieux, cette contribution interroge le passage d’une IA conçue comme outil d’assistance à une IA médiatrice ou interlocutrice. Elle propose le concept d</w:t>
+      </w:r>
+      <w:proofErr w:type="gramStart"/>
+      <w:r>
+        <w:rPr>
+          <w:color w:val="23323A"/>
+          <w:szCs w:val="18"/>
+          <w:lang w:val="fr-FR"/>
+        </w:rPr>
+        <w:t>’«</w:t>
+      </w:r>
+      <w:proofErr w:type="gramEnd"/>
+      <w:r>
+        <w:rPr>
+          <w:color w:val="23323A"/>
+          <w:szCs w:val="18"/>
+          <w:lang w:val="fr-FR"/>
+        </w:rPr>
+        <w:t xml:space="preserve"> intelligence dialogique » pour désigner une compétence fondée sur l’écoute, la décentration, le discernement, la reconnaissance de l’altérité et la responsabilité. L’enjeu est de penser une éducation qui utilise l’IA sans lui déléguer le jugement humain, et qui fasse du dialogue interreligieux un apprentissage de la rencontre.</w:t>
       </w:r>
     </w:p>
     <w:p>
@@ -12141,16 +12554,7 @@
           <w:szCs w:val="18"/>
           <w:lang w:val="fr-FR"/>
         </w:rPr>
-        <w:t xml:space="preserve">Depuis les premiers siècles du Christianisme, la musique sacrée exprime la relation de l’être humain avec le Sacré et représente une tradition spirituelle, religieuse et culturelle enracinée et préservée dans les langues et rites liturgiques des différentes Églises. S’appuyant sur des recherches antérieures qui identifient la musique sacrée comme un instrument non violent du dialogue interreligieux, cet article </w:t>
-      </w:r>
-      <w:r>
-        <w:rPr>
-          <w:color w:val="23323A"/>
-          <w:szCs w:val="18"/>
-          <w:lang w:val="fr-FR"/>
-        </w:rPr>
-        <w:lastRenderedPageBreak/>
-        <w:t>explore le rôle de la musique sacrée dans la création d’espaces sûrs et créatifs pour le dialogue interreligieux, tout en prenant en compte ses caractéristiques distinctives. Une attention sera accordée aux influences et aux échanges entre les traditions de la musique sacrée (chrétienne) au Levant, les traditions musicales islamiques et la musique arabe. À l’ère de l’intelligence artificielle, qui offre de nombreuses possibilités et de nombreux outils, surtout en ce qui concerne la préservation et l’archivage de ces traditions, des défis apparaissent, y compris le risque de transformer la musique en données. Dans ce processus, des œuvres peuvent risquer de disparaître, non pas en termes de sons, mais quant à leur sens profond et à leur expression spirituelle de la relation entre l’être humain et Dieu. Cet article explore les principes du dialogue comme une rencontre authentique, au cours de laquelle l’écoute et l’empathie requièrent de l’intelligence humaine.</w:t>
+        <w:t>Depuis les premiers siècles du Christianisme, la musique sacrée exprime la relation de l’être humain avec le Sacré et représente une tradition spirituelle, religieuse et culturelle enracinée et préservée dans les langues et rites liturgiques des différentes Églises. S’appuyant sur des recherches antérieures qui identifient la musique sacrée comme un instrument non violent du dialogue interreligieux, cet article explore le rôle de la musique sacrée dans la création d’espaces sûrs et créatifs pour le dialogue interreligieux, tout en prenant en compte ses caractéristiques distinctives. Une attention sera accordée aux influences et aux échanges entre les traditions de la musique sacrée (chrétienne) au Levant, les traditions musicales islamiques et la musique arabe. À l’ère de l’intelligence artificielle, qui offre de nombreuses possibilités et de nombreux outils, surtout en ce qui concerne la préservation et l’archivage de ces traditions, des défis apparaissent, y compris le risque de transformer la musique en données. Dans ce processus, des œuvres peuvent risquer de disparaître, non pas en termes de sons, mais quant à leur sens profond et à leur expression spirituelle de la relation entre l’être humain et Dieu. Cet article explore les principes du dialogue comme une rencontre authentique, au cours de laquelle l’écoute et l’empathie requièrent de l’intelligence humaine.</w:t>
       </w:r>
     </w:p>
     <w:p>
@@ -12378,8 +12782,44 @@
           <w:szCs w:val="18"/>
           <w:lang w:val="fr-FR"/>
         </w:rPr>
-        <w:t>Gouverner de façon éclairée n’est pas facile. Engager la compétence coûte cher. Intégrer toute information utile est démesuré. Le potentiel de l’IA comme outil de gestion organisationnelle et d’action politique adaptée à un maximum de données est immense. L’état d’esprit commun dans lequel s’engage aujourd’hui le réflexe de recours à l’IA est par contre alarmant. Les standards de construction des algorithmes, qui structurent en silence la façon dominante d’y recourir, sont le fruit de politiques centrées sur l’intérêt financier, égoïste et privé, des puissances économiques qui en ont massivement financé l’avancement rapide. Tous ces standards reposent sur une seule et même idée : il est avantageux de construire une suite d’instructions logiques permettant à l’ordinateur d’arriver à des décisions autonomes parce que cela réduit le fardeau décisionnel humain, donc les coûts élevés d’un personnel compétent. Une question cruciale, en pareil contexte, demeure régulièrement passée sous silence… Qu’en est-il de l’avantage non pas économique, mais éthique, politique, juridique et religieux, d’une décision humaine qui coûte plus cher, mais qui demeure capable, au besoin, de s’émanciper d’une chaîne rigide d’instructions lorsqu’elle conduit, dans les faits, à sacrifier les valeurs humaines au rendement économique?</w:t>
-      </w:r>
+        <w:t xml:space="preserve">Gouverner de façon éclairée n’est pas facile. Engager la compétence coûte cher. Intégrer toute information utile est démesuré. Le potentiel de l’IA comme outil de gestion organisationnelle et d’action politique adaptée à un maximum de données est immense. L’état d’esprit commun dans lequel s’engage aujourd’hui le réflexe de recours à l’IA est </w:t>
+      </w:r>
+      <w:proofErr w:type="gramStart"/>
+      <w:r>
+        <w:rPr>
+          <w:color w:val="23323A"/>
+          <w:szCs w:val="18"/>
+          <w:lang w:val="fr-FR"/>
+        </w:rPr>
+        <w:t>par contre</w:t>
+      </w:r>
+      <w:proofErr w:type="gramEnd"/>
+      <w:r>
+        <w:rPr>
+          <w:color w:val="23323A"/>
+          <w:szCs w:val="18"/>
+          <w:lang w:val="fr-FR"/>
+        </w:rPr>
+        <w:t xml:space="preserve"> alarmant. Les standards de construction des algorithmes, qui structurent en silence la façon dominante d’y recourir, sont le fruit de politiques centrées sur l’intérêt financier, égoïste et privé, des puissances économiques qui </w:t>
+      </w:r>
+      <w:r>
+        <w:rPr>
+          <w:color w:val="23323A"/>
+          <w:szCs w:val="18"/>
+          <w:lang w:val="fr-FR"/>
+        </w:rPr>
+        <w:t xml:space="preserve">en ont massivement financé l’avancement rapide. Tous ces standards reposent sur une seule et même idée : il est avantageux de construire une suite d’instructions logiques permettant à l’ordinateur d’arriver à des décisions autonomes parce que cela réduit le fardeau décisionnel humain, donc les coûts élevés d’un personnel compétent. Une question cruciale, en pareil contexte, demeure régulièrement passée sous silence… Qu’en est-il de l’avantage non pas économique, mais éthique, politique, juridique et religieux, d’une décision humaine qui coûte plus cher, mais qui demeure capable, au besoin, de s’émanciper d’une chaîne rigide d’instructions lorsqu’elle conduit, dans les faits, à sacrifier les valeurs humaines au rendement </w:t>
+      </w:r>
+      <w:proofErr w:type="gramStart"/>
+      <w:r>
+        <w:rPr>
+          <w:color w:val="23323A"/>
+          <w:szCs w:val="18"/>
+          <w:lang w:val="fr-FR"/>
+        </w:rPr>
+        <w:t>économique?</w:t>
+      </w:r>
+      <w:proofErr w:type="gramEnd"/>
     </w:p>
     <w:p>
       <w:pPr>
@@ -12672,7 +13112,16 @@
           <w:szCs w:val="18"/>
           <w:lang w:val="fr-FR"/>
         </w:rPr>
-        <w:t xml:space="preserve">. Alors que le développement technologique transforme profondément la communication et les relations sociales, le texte pontifical réaffirme la primauté de la personne humaine et rejette toute réduction de l’individu à des données statistiques ou fonctionnelles. Bien que l’IA puisse constituer une aide précieuse pour l’accès aux textes sacrés et la recherche de connaissances, elle demeure confinée à une logique dépourvue de conscience morale, d’empathie et de profondeur spirituelle. Dès lors, la simulation d’une autorité sacrée par des algorithmes pose de graves risques de nivellement théologique, de manipulation et d’altération de la vérité. Pour dépasser le paradigme technocratique, Magnifica </w:t>
+        <w:t xml:space="preserve">. Alors que le développement technologique transforme profondément la communication et les relations sociales, le texte pontifical réaffirme la primauté de la personne humaine et rejette toute réduction de l’individu à des données statistiques ou fonctionnelles. Bien que l’IA puisse constituer une aide précieuse pour </w:t>
+      </w:r>
+      <w:r>
+        <w:rPr>
+          <w:color w:val="23323A"/>
+          <w:szCs w:val="18"/>
+          <w:lang w:val="fr-FR"/>
+        </w:rPr>
+        <w:lastRenderedPageBreak/>
+        <w:t xml:space="preserve">l’accès aux textes sacrés et la recherche de connaissances, elle demeure confinée à une logique dépourvue de conscience morale, d’empathie et de profondeur spirituelle. Dès lors, la simulation d’une autorité sacrée par des algorithmes pose de graves risques de nivellement théologique, de manipulation et d’altération de la vérité. Pour dépasser le paradigme technocratique, Magnifica </w:t>
       </w:r>
       <w:proofErr w:type="spellStart"/>
       <w:r>
@@ -12739,7 +13188,6 @@
           <w:szCs w:val="18"/>
           <w:lang w:val="fr-CA"/>
         </w:rPr>
-        <w:lastRenderedPageBreak/>
         <w:t>Emmanuel Pisani · Institut dominicain d’études orientales (IDEO), Le Caire / PLURIEL</w:t>
       </w:r>
     </w:p>
@@ -13106,7 +13554,15 @@
           <w:szCs w:val="18"/>
           <w:lang w:val="fr-CA"/>
         </w:rPr>
-        <w:t xml:space="preserve"> AI), la communication soutient que les principes contraignant un système intervenant dans le champ religieux ne peuvent être choisis par des acteurs privés : ils doivent être hétéronomes à l’égard de ceux qui produisent la technologie et fondés sur le droit public, les droits fondamentaux, la laïcité et le pluralisme constitutionnel, tels qu’ils sont déjà articulés aux différents niveaux de la Convention européenne des droits de l’homme, du droit de l’Union européenne et des constitutions nationales. Trois limites juridiques sont déduites de ce cadre, chacune étant mise en regard d’un paradigme historique propre aux institutions religieuses traitant des informations sensibles : l’interdiction d’orienter les choix spirituels ; l’exclusion de tout contrôle de l’orthodoxie, qui donne un contenu juridique à la neutralité procédurale ; et l’inscription du profilage religieux dans l’ensemble du dispositif du RGPD. Ces trois limites sont enfin traduites en critères opérationnels pour le protocole </w:t>
+        <w:t xml:space="preserve"> AI), la communication soutient que les principes contraignant un système intervenant dans le champ religieux ne peuvent être choisis par des acteurs privés : ils doivent être hétéronomes à l’égard de ceux qui produisent la technologie et fondés sur </w:t>
+      </w:r>
+      <w:r>
+        <w:rPr>
+          <w:color w:val="23323A"/>
+          <w:szCs w:val="18"/>
+          <w:lang w:val="fr-CA"/>
+        </w:rPr>
+        <w:t xml:space="preserve">le droit public, les droits fondamentaux, la laïcité et le pluralisme constitutionnel, tels qu’ils sont déjà articulés aux différents niveaux de la Convention européenne des droits de l’homme, du droit de l’Union européenne et des constitutions nationales. Trois limites juridiques sont déduites de ce cadre, chacune étant mise en regard d’un paradigme historique propre aux institutions religieuses traitant des informations sensibles : l’interdiction d’orienter les choix spirituels ; l’exclusion de tout contrôle de l’orthodoxie, qui donne un contenu juridique à la neutralité procédurale ; et l’inscription du profilage religieux dans l’ensemble du dispositif du RGPD. Ces trois limites sont enfin traduites en critères opérationnels pour le protocole </w:t>
       </w:r>
       <w:proofErr w:type="spellStart"/>
       <w:r>
@@ -13124,15 +13580,7 @@
           <w:szCs w:val="18"/>
           <w:lang w:val="fr-CA"/>
         </w:rPr>
-        <w:t xml:space="preserve">, sous la forme de trois questions à ajouter à la grille comparant l’évaluation humaine et algorithmique. Tant que la responsabilité ne peut être attribuée à la machine, l’interlocuteur d’IA demeure une métaphore : le dialogue </w:t>
-      </w:r>
-      <w:r>
-        <w:rPr>
-          <w:color w:val="23323A"/>
-          <w:szCs w:val="18"/>
-          <w:lang w:val="fr-CA"/>
-        </w:rPr>
-        <w:t>reste entre humains, médiatisé par un artefact dont les humains écrivent la constitution.</w:t>
+        <w:t>, sous la forme de trois questions à ajouter à la grille comparant l’évaluation humaine et algorithmique. Tant que la responsabilité ne peut être attribuée à la machine, l’interlocuteur d’IA demeure une métaphore : le dialogue reste entre humains, médiatisé par un artefact dont les humains écrivent la constitution.</w:t>
       </w:r>
     </w:p>
     <w:p>
@@ -13356,34 +13804,16 @@
           <w:szCs w:val="18"/>
           <w:lang w:val="fr-CA"/>
         </w:rPr>
-        <w:t>Cette communication propose d’examiner les conditions éthiques de gouvernance d’une IA appelée à intervenir dans des contextes marqués par la pluralité des croyances, des traditions et des interprétations religieuses. L’enjeu consiste à réfléchir au rôle que peut jouer une IA lorsqu’elle agit comme intermédiaire dans la production, la sélection, la hiérarchisation ou la reformulation de contenus religieux, ainsi qu’à ce que nous sommes prêts à lui déléguer dans ces espaces de dialogue. À partir des travaux en éthique et en gouvernance de l’IA, la présentation analysera plusieurs principes susceptibles d’encadrer cette médiation algorithmique : la transparence des sources et des processus de génération, la responsabilité des acteurs qui développent et déploient ces systèmes, la contestabilité des représentations religieuses produites ainsi que la participation des communautés concernées à leur gouvernance. Elle s’interrogera plus particulièrement sur les conditions dans lesquelles une IA peut intervenir dans des espaces de dialogue religieux sans se substituer aux communautés interprétatives. Il s’agira enfin de discuter des limites éthiques de cette intervention afin de préserver la diversité des interprétations, l’autonomie des communautés concernées et la centralité du jugement humain.</w:t>
-      </w:r>
-    </w:p>
-    <w:p>
-      <w:pPr>
-        <w:keepNext/>
-        <w:keepLines/>
-        <w:spacing w:before="4" w:after="4" w:line="144" w:lineRule="auto"/>
-        <w:rPr>
-          <w:b/>
-          <w:color w:val="8A4357"/>
+        <w:t xml:space="preserve">Cette communication propose d’examiner les conditions éthiques de gouvernance d’une IA appelée à intervenir dans des contextes marqués par la pluralité des croyances, des traditions et des interprétations religieuses. L’enjeu consiste à réfléchir au rôle que peut jouer une IA lorsqu’elle agit comme intermédiaire dans la production, la sélection, la hiérarchisation ou la reformulation de contenus religieux, ainsi qu’à ce que nous sommes prêts à lui déléguer dans ces espaces de dialogue. À partir des travaux en éthique et en gouvernance de l’IA, la présentation analysera plusieurs </w:t>
+      </w:r>
+      <w:r>
+        <w:rPr>
           <w:szCs w:val="18"/>
           <w:lang w:val="fr-CA"/>
         </w:rPr>
-      </w:pPr>
-    </w:p>
-    <w:p>
-      <w:pPr>
-        <w:keepNext/>
-        <w:keepLines/>
-        <w:spacing w:before="24" w:after="0" w:line="228" w:lineRule="auto"/>
-        <w:rPr>
-          <w:b/>
-          <w:bCs/>
-          <w:szCs w:val="18"/>
-          <w:lang w:val="fr-CA"/>
-        </w:rPr>
-      </w:pPr>
+        <w:lastRenderedPageBreak/>
+        <w:t>principes susceptibles d’encadrer cette médiation algorithmique : la transparence des sources et des processus de génération, la responsabilité des acteurs qui développent et déploient ces systèmes, la contestabilité des représentations religieuses produites ainsi que la participation des communautés concernées à leur gouvernance. Elle s’interrogera plus particulièrement sur les conditions dans lesquelles une IA peut intervenir dans des espaces de dialogue religieux sans se substituer aux communautés interprétatives. Il s’agira enfin de discuter des limites éthiques de cette intervention afin de préserver la diversité des interprétations, l’autonomie des communautés concernées et la centralité du jugement humain.</w:t>
+      </w:r>
     </w:p>
     <w:p>
       <w:pPr>
@@ -14142,15 +14572,7 @@
           <w:sz w:val="22"/>
           <w:lang w:val="fr-FR"/>
         </w:rPr>
-        <w:t xml:space="preserve"> afin de préciser les sources, </w:t>
-      </w:r>
-      <w:r>
-        <w:rPr>
-          <w:color w:val="23323A"/>
-          <w:sz w:val="22"/>
-          <w:lang w:val="fr-FR"/>
-        </w:rPr>
-        <w:t>les critères de qualité dialogique, les possibilités de correction et la supervision scientifique et éthique.</w:t>
+        <w:t xml:space="preserve"> afin de préciser les sources, les critères de qualité dialogique, les possibilités de correction et la supervision scientifique et éthique.</w:t>
       </w:r>
     </w:p>
     <w:p>
@@ -14891,7 +15313,6 @@
               <w:rPr>
                 <w:noProof/>
               </w:rPr>
-              <w:lastRenderedPageBreak/>
               <w:drawing>
                 <wp:inline distT="0" distB="0" distL="0" distR="0" wp14:anchorId="1FAFA312" wp14:editId="300FB717">
                   <wp:extent cx="1188720" cy="401072"/>
@@ -17062,13 +17483,170 @@
         <mc:AlternateContent>
           <mc:Choice Requires="wps">
             <w:drawing>
-              <wp:anchor distT="0" distB="0" distL="114300" distR="114300" simplePos="0" relativeHeight="251660288" behindDoc="0" locked="0" layoutInCell="1" allowOverlap="1" wp14:anchorId="08E3B56B" wp14:editId="44828BA1">
+              <wp:anchor distT="0" distB="0" distL="114300" distR="114300" simplePos="0" relativeHeight="251662336" behindDoc="0" locked="0" layoutInCell="1" allowOverlap="1" wp14:anchorId="1942BEBE" wp14:editId="2A8239B2">
                 <wp:simplePos x="0" y="0"/>
                 <wp:positionH relativeFrom="column">
-                  <wp:posOffset>2178050</wp:posOffset>
+                  <wp:posOffset>4420925</wp:posOffset>
                 </wp:positionH>
                 <wp:positionV relativeFrom="paragraph">
-                  <wp:posOffset>1055370</wp:posOffset>
+                  <wp:posOffset>1028065</wp:posOffset>
+                </wp:positionV>
+                <wp:extent cx="1494845" cy="914400"/>
+                <wp:effectExtent l="0" t="0" r="10160" b="19050"/>
+                <wp:wrapNone/>
+                <wp:docPr id="150358924" name="Zone de texte 3"/>
+                <wp:cNvGraphicFramePr/>
+                <a:graphic xmlns:a="http://schemas.openxmlformats.org/drawingml/2006/main">
+                  <a:graphicData uri="http://schemas.microsoft.com/office/word/2010/wordprocessingShape">
+                    <wps:wsp>
+                      <wps:cNvSpPr txBox="1"/>
+                      <wps:spPr>
+                        <a:xfrm>
+                          <a:off x="0" y="0"/>
+                          <a:ext cx="1494845" cy="914400"/>
+                        </a:xfrm>
+                        <a:prstGeom prst="rect">
+                          <a:avLst/>
+                        </a:prstGeom>
+                        <a:solidFill>
+                          <a:sysClr val="window" lastClr="FFFFFF"/>
+                        </a:solidFill>
+                        <a:ln w="6350">
+                          <a:solidFill>
+                            <a:prstClr val="black"/>
+                          </a:solidFill>
+                        </a:ln>
+                      </wps:spPr>
+                      <wps:txbx>
+                        <w:txbxContent>
+                          <w:p>
+                            <w:r>
+                              <w:drawing>
+                                <wp:inline distT="0" distB="0" distL="0" distR="0" wp14:anchorId="04C4031F" wp14:editId="6EB88204">
+                                  <wp:extent cx="1305560" cy="795131"/>
+                                  <wp:effectExtent l="0" t="0" r="8890" b="5080"/>
+                                  <wp:docPr id="1646263878" name="Image 1"/>
+                                  <wp:cNvGraphicFramePr>
+                                    <a:graphicFrameLocks xmlns:a="http://schemas.openxmlformats.org/drawingml/2006/main" noChangeAspect="1"/>
+                                  </wp:cNvGraphicFramePr>
+                                  <a:graphic xmlns:a="http://schemas.openxmlformats.org/drawingml/2006/main">
+                                    <a:graphicData uri="http://schemas.openxmlformats.org/drawingml/2006/picture">
+                                      <pic:pic xmlns:pic="http://schemas.openxmlformats.org/drawingml/2006/picture">
+                                        <pic:nvPicPr>
+                                          <pic:cNvPr id="1646263878" name=""/>
+                                          <pic:cNvPicPr/>
+                                        </pic:nvPicPr>
+                                        <pic:blipFill>
+                                          <a:blip r:embed="rId40"/>
+                                          <a:stretch>
+                                            <a:fillRect/>
+                                          </a:stretch>
+                                        </pic:blipFill>
+                                        <pic:spPr>
+                                          <a:xfrm>
+                                            <a:off x="0" y="0"/>
+                                            <a:ext cx="1310250" cy="797987"/>
+                                          </a:xfrm>
+                                          <a:prstGeom prst="rect">
+                                            <a:avLst/>
+                                          </a:prstGeom>
+                                        </pic:spPr>
+                                      </pic:pic>
+                                    </a:graphicData>
+                                  </a:graphic>
+                                </wp:inline>
+                              </w:drawing>
+                            </w:r>
+                          </w:p>
+                        </w:txbxContent>
+                      </wps:txbx>
+                      <wps:bodyPr rot="0" spcFirstLastPara="0" vertOverflow="overflow" horzOverflow="overflow" vert="horz" wrap="square" lIns="91440" tIns="45720" rIns="91440" bIns="45720" numCol="1" spcCol="0" rtlCol="0" fromWordArt="0" anchor="t" anchorCtr="0" forceAA="0" compatLnSpc="1">
+                        <a:prstTxWarp prst="textNoShape">
+                          <a:avLst/>
+                        </a:prstTxWarp>
+                        <a:noAutofit/>
+                      </wps:bodyPr>
+                    </wps:wsp>
+                  </a:graphicData>
+                </a:graphic>
+                <wp14:sizeRelH relativeFrom="margin">
+                  <wp14:pctWidth>0</wp14:pctWidth>
+                </wp14:sizeRelH>
+              </wp:anchor>
+            </w:drawing>
+          </mc:Choice>
+          <mc:Fallback>
+            <w:pict>
+              <v:shapetype w14:anchorId="1942BEBE" id="_x0000_t202" coordsize="21600,21600" o:spt="202" path="m,l,21600r21600,l21600,xe">
+                <v:stroke joinstyle="miter"/>
+                <v:path gradientshapeok="t" o:connecttype="rect"/>
+              </v:shapetype>
+              <v:shape id="Zone de texte 3" o:spid="_x0000_s1026" type="#_x0000_t202" style="position:absolute;margin-left:348.1pt;margin-top:80.95pt;width:117.7pt;height:1in;z-index:251662336;visibility:visible;mso-wrap-style:square;mso-width-percent:0;mso-wrap-distance-left:9pt;mso-wrap-distance-top:0;mso-wrap-distance-right:9pt;mso-wrap-distance-bottom:0;mso-position-horizontal:absolute;mso-position-horizontal-relative:text;mso-position-vertical:absolute;mso-position-vertical-relative:text;mso-width-percent:0;mso-width-relative:margin;v-text-anchor:top" o:gfxdata="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" fillcolor="window" strokeweight=".5pt">
+                <v:textbox>
+                  <w:txbxContent>
+                    <w:p>
+                      <w:r>
+                        <w:drawing>
+                          <wp:inline distT="0" distB="0" distL="0" distR="0" wp14:anchorId="04C4031F" wp14:editId="6EB88204">
+                            <wp:extent cx="1305560" cy="795131"/>
+                            <wp:effectExtent l="0" t="0" r="8890" b="5080"/>
+                            <wp:docPr id="1646263878" name="Image 1"/>
+                            <wp:cNvGraphicFramePr>
+                              <a:graphicFrameLocks xmlns:a="http://schemas.openxmlformats.org/drawingml/2006/main" noChangeAspect="1"/>
+                            </wp:cNvGraphicFramePr>
+                            <a:graphic xmlns:a="http://schemas.openxmlformats.org/drawingml/2006/main">
+                              <a:graphicData uri="http://schemas.openxmlformats.org/drawingml/2006/picture">
+                                <pic:pic xmlns:pic="http://schemas.openxmlformats.org/drawingml/2006/picture">
+                                  <pic:nvPicPr>
+                                    <pic:cNvPr id="1646263878" name=""/>
+                                    <pic:cNvPicPr/>
+                                  </pic:nvPicPr>
+                                  <pic:blipFill>
+                                    <a:blip r:embed="rId40"/>
+                                    <a:stretch>
+                                      <a:fillRect/>
+                                    </a:stretch>
+                                  </pic:blipFill>
+                                  <pic:spPr>
+                                    <a:xfrm>
+                                      <a:off x="0" y="0"/>
+                                      <a:ext cx="1310250" cy="797987"/>
+                                    </a:xfrm>
+                                    <a:prstGeom prst="rect">
+                                      <a:avLst/>
+                                    </a:prstGeom>
+                                  </pic:spPr>
+                                </pic:pic>
+                              </a:graphicData>
+                            </a:graphic>
+                          </wp:inline>
+                        </w:drawing>
+                      </w:r>
+                    </w:p>
+                  </w:txbxContent>
+                </v:textbox>
+              </v:shape>
+            </w:pict>
+          </mc:Fallback>
+        </mc:AlternateContent>
+      </w:r>
+      <w:r>
+        <w:rPr>
+          <w:rFonts w:eastAsia="Times New Roman" w:cs="Arial"/>
+          <w:noProof/>
+          <w:sz w:val="22"/>
+          <w:lang w:val="fr-FR"/>
+        </w:rPr>
+        <mc:AlternateContent>
+          <mc:Choice Requires="wps">
+            <w:drawing>
+              <wp:anchor distT="0" distB="0" distL="114300" distR="114300" simplePos="0" relativeHeight="251660288" behindDoc="0" locked="0" layoutInCell="1" allowOverlap="1" wp14:anchorId="08E3B56B" wp14:editId="59DA52C0">
+                <wp:simplePos x="0" y="0"/>
+                <wp:positionH relativeFrom="column">
+                  <wp:posOffset>1009208</wp:posOffset>
+                </wp:positionH>
+                <wp:positionV relativeFrom="paragraph">
+                  <wp:posOffset>1034829</wp:posOffset>
                 </wp:positionV>
                 <wp:extent cx="3390900" cy="914400"/>
                 <wp:effectExtent l="0" t="0" r="19050" b="19050"/>
@@ -17121,7 +17699,7 @@
                                           </pic:cNvPicPr>
                                         </pic:nvPicPr>
                                         <pic:blipFill>
-                                          <a:blip r:embed="rId40">
+                                          <a:blip r:embed="rId41">
                                             <a:alphaModFix/>
                                             <a:extLst>
                                               <a:ext uri="{28A0092B-C50C-407E-A947-70E740481C1C}">
@@ -17173,15 +17751,14 @@
           </mc:Choice>
           <mc:Fallback>
             <w:pict>
-              <v:shapetype w14:anchorId="08E3B56B" id="_x0000_t202" coordsize="21600,21600" o:spt="202" path="m,l,21600r21600,l21600,xe">
-                <v:stroke joinstyle="miter"/>
-                <v:path gradientshapeok="t" o:connecttype="rect"/>
-              </v:shapetype>
-              <v:shape id="Text Box 4" o:spid="_x0000_s1026" type="#_x0000_t202" style="position:absolute;margin-left:171.5pt;margin-top:83.1pt;width:267pt;height:1in;z-index:251660288;visibility:visible;mso-wrap-style:square;mso-width-percent:0;mso-wrap-distance-left:9pt;mso-wrap-distance-top:0;mso-wrap-distance-right:9pt;mso-wrap-distance-bottom:0;mso-position-horizontal:absolute;mso-position-horizontal-relative:text;mso-position-vertical:absolute;mso-position-vertical-relative:text;mso-width-percent:0;mso-width-relative:margin;v-text-anchor:top" o:gfxdata="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" fillcolor="white [3201]" strokeweight=".5pt">
+              <v:shape w14:anchorId="08E3B56B" id="Text Box 4" o:spid="_x0000_s1027" type="#_x0000_t202" style="position:absolute;margin-left:79.45pt;margin-top:81.5pt;width:267pt;height:1in;z-index:251660288;visibility:visible;mso-wrap-style:square;mso-width-percent:0;mso-wrap-distance-left:9pt;mso-wrap-distance-top:0;mso-wrap-distance-right:9pt;mso-wrap-distance-bottom:0;mso-position-horizontal:absolute;mso-position-horizontal-relative:text;mso-position-vertical:absolute;mso-position-vertical-relative:text;mso-width-percent:0;mso-width-relative:margin;v-text-anchor:top" o:gfxdata="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" fillcolor="white [3201]" strokeweight=".5pt">
                 <v:textbox>
                   <w:txbxContent>
                     <w:p>
                       <w:r>
+                        <w:rPr>
+                          <w:noProof/>
+                        </w:rPr>
                         <w:drawing>
                           <wp:inline distT="0" distB="0" distL="0" distR="0" wp14:anchorId="74EC28A6" wp14:editId="3131B6DD">
                             <wp:extent cx="3181350" cy="838200"/>
@@ -17540,11 +18117,7 @@
           </mc:Choice>
           <mc:Fallback>
             <w:pict>
-              <v:shapetype w14:anchorId="29A2D861" id="_x0000_t202" coordsize="21600,21600" o:spt="202" path="m,l,21600r21600,l21600,xe">
-                <v:stroke joinstyle="miter"/>
-                <v:path gradientshapeok="t" o:connecttype="rect"/>
-              </v:shapetype>
-              <v:shape id="Text Box 4" o:spid="_x0000_s1026" type="#_x0000_t202" style="position:absolute;margin-left:428.8pt;margin-top:0;width:480pt;height:81pt;z-index:251659264;visibility:visible;mso-wrap-style:square;mso-width-percent:0;mso-height-percent:0;mso-wrap-distance-left:9pt;mso-wrap-distance-top:0;mso-wrap-distance-right:9pt;mso-wrap-distance-bottom:0;mso-position-horizontal:right;mso-position-horizontal-relative:margin;mso-position-vertical:absolute;mso-position-vertical-relative:text;mso-width-percent:0;mso-height-percent:0;mso-width-relative:margin;mso-height-relative:margin;v-text-anchor:top" o:gfxdata="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" fillcolor="window" strokeweight=".5pt">
+              <v:shape w14:anchorId="29A2D861" id="_x0000_s1028" type="#_x0000_t202" style="position:absolute;margin-left:428.8pt;margin-top:0;width:480pt;height:81pt;z-index:251659264;visibility:visible;mso-wrap-style:square;mso-width-percent:0;mso-height-percent:0;mso-wrap-distance-left:9pt;mso-wrap-distance-top:0;mso-wrap-distance-right:9pt;mso-wrap-distance-bottom:0;mso-position-horizontal:right;mso-position-horizontal-relative:margin;mso-position-vertical:absolute;mso-position-vertical-relative:text;mso-width-percent:0;mso-height-percent:0;mso-width-relative:margin;mso-height-relative:margin;v-text-anchor:top" o:gfxdata="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" fillcolor="window" strokeweight=".5pt">
                 <v:textbox>
                   <w:txbxContent>
                     <w:p>
@@ -17556,7 +18129,7 @@
                           <wp:inline distT="0" distB="0" distL="0" distR="0" wp14:anchorId="1B6F98D5" wp14:editId="2346E0E6">
                             <wp:extent cx="1390650" cy="816610"/>
                             <wp:effectExtent l="0" t="0" r="0" b="2540"/>
-                            <wp:docPr id="1558989926" name="Picture 1"/>
+                            <wp:docPr id="791048337" name="Picture 1"/>
                             <wp:cNvGraphicFramePr>
                               <a:graphicFrameLocks xmlns:a="http://schemas.openxmlformats.org/drawingml/2006/main" noChangeAspect="1"/>
                             </wp:cNvGraphicFramePr>
@@ -17568,11 +18141,11 @@
                                     <pic:cNvPicPr/>
                                   </pic:nvPicPr>
                                   <pic:blipFill>
-                                    <a:blip r:embed="rId49">
+                                    <a:blip r:embed="rId42">
                                       <a:extLst>
                                         <a:ext uri="{BEBA8EAE-BF5A-486C-A8C5-ECC9F3942E4B}">
                                           <a14:imgProps xmlns:a14="http://schemas.microsoft.com/office/drawing/2010/main">
-                                            <a14:imgLayer r:embed="rId50">
+                                            <a14:imgLayer r:embed="rId43">
                                               <a14:imgEffect>
                                                 <a14:sharpenSoften amount="25000"/>
                                               </a14:imgEffect>
@@ -17614,10 +18187,10 @@
                           <w:noProof/>
                         </w:rPr>
                         <w:drawing>
-                          <wp:inline distT="0" distB="0" distL="0" distR="0" wp14:anchorId="712E8FE6" wp14:editId="76DC4FCE">
+                          <wp:inline distT="0" distB="0" distL="0" distR="0" wp14:anchorId="712E8FE6" wp14:editId="49ECA3AE">
                             <wp:extent cx="1524000" cy="816610"/>
                             <wp:effectExtent l="0" t="0" r="0" b="2540"/>
-                            <wp:docPr id="2013221846" name="Picture 1"/>
+                            <wp:docPr id="2073725972" name="Picture 1"/>
                             <wp:cNvGraphicFramePr>
                               <a:graphicFrameLocks xmlns:a="http://schemas.openxmlformats.org/drawingml/2006/main" noChangeAspect="1"/>
                             </wp:cNvGraphicFramePr>
@@ -17629,13 +18202,13 @@
                                     <pic:cNvPicPr/>
                                   </pic:nvPicPr>
                                   <pic:blipFill>
-                                    <a:blip r:embed="rId51">
+                                    <a:blip r:embed="rId44">
                                       <a:extLst>
                                         <a:ext uri="{BEBA8EAE-BF5A-486C-A8C5-ECC9F3942E4B}">
                                           <a14:imgProps xmlns:a14="http://schemas.microsoft.com/office/drawing/2010/main">
-                                            <a14:imgLayer r:embed="rId52">
+                                            <a14:imgLayer r:embed="rId45">
                                               <a14:imgEffect>
-                                                <a14:sharpenSoften amount="25000"/>
+                                                <a14:sharpenSoften amount="50000"/>
                                               </a14:imgEffect>
                                             </a14:imgLayer>
                                           </a14:imgProps>
@@ -17675,7 +18248,7 @@
                           <wp:inline distT="0" distB="0" distL="0" distR="0" wp14:anchorId="72DD811F" wp14:editId="6A19B25B">
                             <wp:extent cx="1390650" cy="816610"/>
                             <wp:effectExtent l="0" t="0" r="0" b="2540"/>
-                            <wp:docPr id="360045617" name="Picture 1"/>
+                            <wp:docPr id="679810236" name="Picture 1"/>
                             <wp:cNvGraphicFramePr>
                               <a:graphicFrameLocks xmlns:a="http://schemas.openxmlformats.org/drawingml/2006/main" noChangeAspect="1"/>
                             </wp:cNvGraphicFramePr>
@@ -17687,11 +18260,11 @@
                                     <pic:cNvPicPr/>
                                   </pic:nvPicPr>
                                   <pic:blipFill>
-                                    <a:blip r:embed="rId53">
+                                    <a:blip r:embed="rId46">
                                       <a:extLst>
                                         <a:ext uri="{BEBA8EAE-BF5A-486C-A8C5-ECC9F3942E4B}">
                                           <a14:imgProps xmlns:a14="http://schemas.microsoft.com/office/drawing/2010/main">
-                                            <a14:imgLayer r:embed="rId54">
+                                            <a14:imgLayer r:embed="rId47">
                                               <a14:imgEffect>
                                                 <a14:sharpenSoften amount="50000"/>
                                               </a14:imgEffect>
@@ -17733,7 +18306,7 @@
                           <wp:inline distT="0" distB="0" distL="0" distR="0" wp14:anchorId="448DDA48" wp14:editId="7CBDB852">
                             <wp:extent cx="1386840" cy="888208"/>
                             <wp:effectExtent l="0" t="0" r="3810" b="7620"/>
-                            <wp:docPr id="1042188011" name="Picture 2"/>
+                            <wp:docPr id="1983966027" name="Picture 2"/>
                             <wp:cNvGraphicFramePr>
                               <a:graphicFrameLocks xmlns:a="http://schemas.openxmlformats.org/drawingml/2006/main" noChangeAspect="1"/>
                             </wp:cNvGraphicFramePr>
@@ -17747,7 +18320,7 @@
                                     </pic:cNvPicPr>
                                   </pic:nvPicPr>
                                   <pic:blipFill>
-                                    <a:blip r:embed="rId55">
+                                    <a:blip r:embed="rId48">
                                       <a:extLst>
                                         <a:ext uri="{28A0092B-C50C-407E-A947-70E740481C1C}">
                                           <a14:useLocalDpi xmlns:a14="http://schemas.microsoft.com/office/drawing/2010/main" val="0"/>
@@ -29761,6 +30334,22 @@
       </w:tcPr>
     </w:tblStylePr>
   </w:style>
+  <w:style w:type="paragraph" w:styleId="NormalWeb">
+    <w:name w:val="Normal (Web)"/>
+    <w:basedOn w:val="Normal"/>
+    <w:uiPriority w:val="99"/>
+    <w:unhideWhenUsed/>
+    <w:rsid w:val="006B7830"/>
+    <w:pPr>
+      <w:spacing w:before="100" w:beforeAutospacing="1" w:after="100" w:afterAutospacing="1" w:line="240" w:lineRule="auto"/>
+    </w:pPr>
+    <w:rPr>
+      <w:rFonts w:ascii="Times New Roman" w:eastAsia="Times New Roman" w:hAnsi="Times New Roman" w:cs="Times New Roman"/>
+      <w:sz w:val="24"/>
+      <w:szCs w:val="24"/>
+      <w:lang w:val="en-AE" w:eastAsia="en-AE"/>
+    </w:rPr>
+  </w:style>
 </w:styles>
 </file>
 

</xml_diff>